<commit_message>
Finaliza sistema conforme TCD com persistencia dupla
Atualiza persistencia em binario e texto, simplifica suporte a acentos para Windows e renova a documentacao do projeto.

Co-authored-by: Cursor <cursoragent@cursor.com>
</commit_message>
<xml_diff>
--- a/Documentacao_Sistema_Biblioteca.docx
+++ b/Documentacao_Sistema_Biblioteca.docx
@@ -15,7 +15,7 @@
         <w:jc w:val="center"/>
       </w:pPr>
       <w:r>
-        <w:t>Documentacao tecnica do projeto</w:t>
+        <w:t>Documentacao tecnica do projeto - TCD 2</w:t>
       </w:r>
     </w:p>
     <w:p>
@@ -31,7 +31,7 @@
         <w:spacing w:after="120"/>
       </w:pPr>
       <w:r>
-        <w:t>O Sistema de Biblioteca e um programa em linguagem C que gerencia o cadastro, consulta, emprestimo e devolucao de livros. Os dados sao armazenados em memoria dinamica (malloc/realloc/free) e persistidos em arquivo texto (biblioteca.txt). A interface e totalmente em linha de comando (CMD), com menu interativo no terminal.</w:t>
+        <w:t>O Sistema de Biblioteca e um programa em linguagem C desenvolvido para o Trabalho de Conclusao da Disciplina (TCD 2) de Algoritmos e Estruturas de Dados. O sistema gerencia o cadastro, consulta, emprestimo e devolucao de livros, com persistencia em arquivo binario e texto. A interface e em linha de comando (CMD), com menu interativo no terminal.</w:t>
       </w:r>
     </w:p>
     <w:p>
@@ -39,7 +39,7 @@
         <w:pStyle w:val="Heading1"/>
       </w:pPr>
       <w:r>
-        <w:t>2. Arquitetura do Projeto</w:t>
+        <w:t>2. Requisitos do Trabalho</w:t>
       </w:r>
     </w:p>
     <w:p>
@@ -47,7 +47,7 @@
         <w:spacing w:after="120"/>
       </w:pPr>
       <w:r>
-        <w:t>O codigo esta organizado em modulos separados, cada um com responsabilidade definida:</w:t>
+        <w:t>O sistema atende aos requisitos do enunciado:</w:t>
       </w:r>
     </w:p>
     <w:p>
@@ -55,7 +55,7 @@
         <w:pStyle w:val="ListBullet"/>
       </w:pPr>
       <w:r>
-        <w:t>livro.h — definicao da struct Livro, variaveis globais e prototipos de funcoes</w:t>
+        <w:t>Struct Livro com codigo, titulo, autor, ano e quantidade disponivel</w:t>
       </w:r>
     </w:p>
     <w:p>
@@ -63,7 +63,7 @@
         <w:pStyle w:val="ListBullet"/>
       </w:pPr>
       <w:r>
-        <w:t>main.c — ponto de entrada: carrega dados e inicia o menu</w:t>
+        <w:t>Cadastrar livros</w:t>
       </w:r>
     </w:p>
     <w:p>
@@ -71,7 +71,7 @@
         <w:pStyle w:val="ListBullet"/>
       </w:pPr>
       <w:r>
-        <w:t>menu.c — interface do usuario no terminal (printf, scanf, fgets)</w:t>
+        <w:t>Listar livros</w:t>
       </w:r>
     </w:p>
     <w:p>
@@ -79,7 +79,7 @@
         <w:pStyle w:val="ListBullet"/>
       </w:pPr>
       <w:r>
-        <w:t>cadastro.c — insercao e listagem de livros</w:t>
+        <w:t>Buscar por codigo ou titulo</w:t>
       </w:r>
     </w:p>
     <w:p>
@@ -87,7 +87,7 @@
         <w:pStyle w:val="ListBullet"/>
       </w:pPr>
       <w:r>
-        <w:t>busca.c — busca por codigo e por titulo</w:t>
+        <w:t>Emprestar livro</w:t>
       </w:r>
     </w:p>
     <w:p>
@@ -95,7 +95,7 @@
         <w:pStyle w:val="ListBullet"/>
       </w:pPr>
       <w:r>
-        <w:t>emprestimo.c — emprestimo e devolucao</w:t>
+        <w:t>Devolver livro</w:t>
       </w:r>
     </w:p>
     <w:p>
@@ -103,7 +103,7 @@
         <w:pStyle w:val="ListBullet"/>
       </w:pPr>
       <w:r>
-        <w:t>relatorio.c — ordenacao e relatorio de indisponiveis</w:t>
+        <w:t>Ordenar por titulo</w:t>
       </w:r>
     </w:p>
     <w:p>
@@ -111,7 +111,7 @@
         <w:pStyle w:val="ListBullet"/>
       </w:pPr>
       <w:r>
-        <w:t>utilidades.c — funcoes auxiliares (indice, formatacao)</w:t>
+        <w:t>Gerar relatorio de livros indisponiveis</w:t>
       </w:r>
     </w:p>
     <w:p>
@@ -119,23 +119,119 @@
         <w:pStyle w:val="ListBullet"/>
       </w:pPr>
       <w:r>
-        <w:t>arquivo.c — leitura e gravacao em biblioteca.txt</w:t>
+        <w:t>Salvar e carregar em arquivo binario</w:t>
       </w:r>
     </w:p>
     <w:p>
       <w:pPr>
-        <w:pStyle w:val="Heading1"/>
+        <w:pStyle w:val="ListBullet"/>
       </w:pPr>
       <w:r>
-        <w:t>3. Estrutura de Dados</w:t>
+        <w:t>Uso de ponteiros para manipular o vetor de structs</w:t>
       </w:r>
     </w:p>
     <w:p>
       <w:pPr>
+        <w:pStyle w:val="ListBullet"/>
+      </w:pPr>
+      <w:r>
+        <w:t>Uso de malloc, realloc e free</w:t>
+      </w:r>
+    </w:p>
+    <w:p>
+      <w:pPr>
+        <w:pStyle w:val="Heading1"/>
+      </w:pPr>
+      <w:r>
+        <w:t>3. Arquitetura do Projeto</w:t>
+      </w:r>
+    </w:p>
+    <w:p>
+      <w:pPr>
         <w:spacing w:after="120"/>
       </w:pPr>
       <w:r>
-        <w:t>A struct Livro armazena as informacoes de cada exemplar:</w:t>
+        <w:t>O codigo esta organizado em modulos:</w:t>
+      </w:r>
+    </w:p>
+    <w:p>
+      <w:pPr>
+        <w:pStyle w:val="ListBullet"/>
+      </w:pPr>
+      <w:r>
+        <w:t>livro.h - struct Livro, variaveis globais e prototipos</w:t>
+      </w:r>
+    </w:p>
+    <w:p>
+      <w:pPr>
+        <w:pStyle w:val="ListBullet"/>
+      </w:pPr>
+      <w:r>
+        <w:t>main.c - ponto de entrada, configuracao de acentos e inicializacao</w:t>
+      </w:r>
+    </w:p>
+    <w:p>
+      <w:pPr>
+        <w:pStyle w:val="ListBullet"/>
+      </w:pPr>
+      <w:r>
+        <w:t>menu.c - interface do usuario no terminal</w:t>
+      </w:r>
+    </w:p>
+    <w:p>
+      <w:pPr>
+        <w:pStyle w:val="ListBullet"/>
+      </w:pPr>
+      <w:r>
+        <w:t>cadastro.c - insercao e listagem de livros</w:t>
+      </w:r>
+    </w:p>
+    <w:p>
+      <w:pPr>
+        <w:pStyle w:val="ListBullet"/>
+      </w:pPr>
+      <w:r>
+        <w:t>busca.c - busca por codigo e por titulo</w:t>
+      </w:r>
+    </w:p>
+    <w:p>
+      <w:pPr>
+        <w:pStyle w:val="ListBullet"/>
+      </w:pPr>
+      <w:r>
+        <w:t>emprestimo.c - emprestimo e devolucao</w:t>
+      </w:r>
+    </w:p>
+    <w:p>
+      <w:pPr>
+        <w:pStyle w:val="ListBullet"/>
+      </w:pPr>
+      <w:r>
+        <w:t>relatorio.c - ordenacao e relatorio de indisponiveis</w:t>
+      </w:r>
+    </w:p>
+    <w:p>
+      <w:pPr>
+        <w:pStyle w:val="ListBullet"/>
+      </w:pPr>
+      <w:r>
+        <w:t>utilidades.c - funcoes auxiliares</w:t>
+      </w:r>
+    </w:p>
+    <w:p>
+      <w:pPr>
+        <w:pStyle w:val="ListBullet"/>
+      </w:pPr>
+      <w:r>
+        <w:t>arquivo.c - persistencia em biblioteca.bin e biblioteca.txt</w:t>
+      </w:r>
+    </w:p>
+    <w:p>
+      <w:pPr>
+        <w:pStyle w:val="Heading1"/>
+      </w:pPr>
+      <w:r>
+        <w:t>4. Estrutura de Dados</w:t>
       </w:r>
     </w:p>
     <w:p>
@@ -207,7 +303,7 @@
         <w:pStyle w:val="Heading1"/>
       </w:pPr>
       <w:r>
-        <w:t>4. Fluxo de Execucao</w:t>
+        <w:t>5. Fluxo de Execucao</w:t>
       </w:r>
     </w:p>
     <w:p>
@@ -215,7 +311,7 @@
         <w:pStyle w:val="ListBullet"/>
       </w:pPr>
       <w:r>
-        <w:t>main() chama carregarArquivo() para ler biblioteca.txt</w:t>
+        <w:t>main() chama configurarAcentos() para suporte a caracteres acentuados</w:t>
       </w:r>
     </w:p>
     <w:p>
@@ -223,7 +319,15 @@
         <w:pStyle w:val="ListBullet"/>
       </w:pPr>
       <w:r>
-        <w:t>main() chama menu() para exibir o menu e processar opcoes</w:t>
+        <w:t>main() chama carregarArquivo() para ler os dados salvos</w:t>
+      </w:r>
+    </w:p>
+    <w:p>
+      <w:pPr>
+        <w:pStyle w:val="ListBullet"/>
+      </w:pPr>
+      <w:r>
+        <w:t>main() chama menu() para exibir o menu e processar as opcoes</w:t>
       </w:r>
     </w:p>
     <w:p>
@@ -239,7 +343,7 @@
         <w:pStyle w:val="Heading1"/>
       </w:pPr>
       <w:r>
-        <w:t>5. Menu do Sistema (menu.c)</w:t>
+        <w:t>6. Menu do Sistema (menu.c)</w:t>
       </w:r>
     </w:p>
     <w:p>
@@ -247,7 +351,7 @@
         <w:spacing w:after="120"/>
       </w:pPr>
       <w:r>
-        <w:t>O arquivo menu.c concentra toda a interacao com o usuario. Funcoes auxiliares internas:</w:t>
+        <w:t>Funcoes auxiliares internas:</w:t>
       </w:r>
     </w:p>
     <w:p>
@@ -255,7 +359,7 @@
         <w:pStyle w:val="ListBullet"/>
       </w:pPr>
       <w:r>
-        <w:t>limparBuffer() — descarta caracteres restantes no buffer de entrada</w:t>
+        <w:t>limparBuffer() - descarta caracteres restantes no buffer de entrada</w:t>
       </w:r>
     </w:p>
     <w:p>
@@ -263,7 +367,7 @@
         <w:pStyle w:val="ListBullet"/>
       </w:pPr>
       <w:r>
-        <w:t>pausar() — aguarda Enter antes de voltar ao menu</w:t>
+        <w:t>pausar() - aguarda Enter antes de voltar ao menu</w:t>
       </w:r>
     </w:p>
     <w:p>
@@ -271,7 +375,7 @@
         <w:pStyle w:val="ListBullet"/>
       </w:pPr>
       <w:r>
-        <w:t>limparTela() — executa system("cls") para limpar o terminal</w:t>
+        <w:t>limparTela() - executa system("cls") para limpar o terminal</w:t>
       </w:r>
     </w:p>
     <w:p>
@@ -279,7 +383,7 @@
         <w:spacing w:after="120"/>
       </w:pPr>
       <w:r>
-        <w:t>Opcoes disponiveis no menu:</w:t>
+        <w:t>Opcoes do menu:</w:t>
       </w:r>
     </w:p>
     <w:p>
@@ -287,7 +391,7 @@
         <w:pStyle w:val="ListBullet"/>
       </w:pPr>
       <w:r>
-        <w:t>1 — Cadastrar livro (entrada via scanf e fgets)</w:t>
+        <w:t>1 - Cadastrar livro</w:t>
       </w:r>
     </w:p>
     <w:p>
@@ -295,7 +399,7 @@
         <w:pStyle w:val="ListBullet"/>
       </w:pPr>
       <w:r>
-        <w:t>2 — Listar todos os livros cadastrados</w:t>
+        <w:t>2 - Listar livros</w:t>
       </w:r>
     </w:p>
     <w:p>
@@ -303,7 +407,7 @@
         <w:pStyle w:val="ListBullet"/>
       </w:pPr>
       <w:r>
-        <w:t>3 — Buscar livro por codigo</w:t>
+        <w:t>3 - Buscar por codigo</w:t>
       </w:r>
     </w:p>
     <w:p>
@@ -311,7 +415,7 @@
         <w:pStyle w:val="ListBullet"/>
       </w:pPr>
       <w:r>
-        <w:t>4 — Buscar livros por titulo (busca parcial)</w:t>
+        <w:t>4 - Buscar por titulo</w:t>
       </w:r>
     </w:p>
     <w:p>
@@ -319,7 +423,7 @@
         <w:pStyle w:val="ListBullet"/>
       </w:pPr>
       <w:r>
-        <w:t>5 — Emprestar livro (reduz quantidade)</w:t>
+        <w:t>5 - Emprestar livro</w:t>
       </w:r>
     </w:p>
     <w:p>
@@ -327,7 +431,7 @@
         <w:pStyle w:val="ListBullet"/>
       </w:pPr>
       <w:r>
-        <w:t>6 — Devolver livro (aumenta quantidade)</w:t>
+        <w:t>6 - Devolver livro</w:t>
       </w:r>
     </w:p>
     <w:p>
@@ -335,7 +439,7 @@
         <w:pStyle w:val="ListBullet"/>
       </w:pPr>
       <w:r>
-        <w:t>7 — Relatorio de livros indisponiveis (quantidade zero)</w:t>
+        <w:t>7 - Relatorio de indisponiveis</w:t>
       </w:r>
     </w:p>
     <w:p>
@@ -343,7 +447,7 @@
         <w:pStyle w:val="ListBullet"/>
       </w:pPr>
       <w:r>
-        <w:t>8 — Ordenar livros por titulo (qsort)</w:t>
+        <w:t>8 - Ordenar por titulo</w:t>
       </w:r>
     </w:p>
     <w:p>
@@ -351,7 +455,7 @@
         <w:pStyle w:val="ListBullet"/>
       </w:pPr>
       <w:r>
-        <w:t>9 — Salvar dados manualmente em biblioteca.txt</w:t>
+        <w:t>9 - Salvar dados</w:t>
       </w:r>
     </w:p>
     <w:p>
@@ -359,7 +463,7 @@
         <w:pStyle w:val="ListBullet"/>
       </w:pPr>
       <w:r>
-        <w:t>0 — Sair (salva automaticamente e encerra)</w:t>
+        <w:t>0 - Sair (salva automaticamente e encerra)</w:t>
       </w:r>
     </w:p>
     <w:p>
@@ -367,7 +471,7 @@
         <w:pStyle w:val="Heading1"/>
       </w:pPr>
       <w:r>
-        <w:t>6. Modulos de Negocio</w:t>
+        <w:t>7. Modulos de Negocio</w:t>
       </w:r>
     </w:p>
     <w:p>
@@ -375,7 +479,7 @@
         <w:pStyle w:val="Heading2"/>
       </w:pPr>
       <w:r>
-        <w:t>6.1 cadastro.c</w:t>
+        <w:t>7.1 cadastro.c</w:t>
       </w:r>
     </w:p>
     <w:p>
@@ -399,7 +503,7 @@
         <w:pStyle w:val="Heading2"/>
       </w:pPr>
       <w:r>
-        <w:t>6.2 busca.c</w:t>
+        <w:t>7.2 busca.c</w:t>
       </w:r>
     </w:p>
     <w:p>
@@ -407,7 +511,7 @@
         <w:spacing w:after="120"/>
       </w:pPr>
       <w:r>
-        <w:t>buscarLivroPorCodigo() localiza um livro pelo codigo e formata o resultado.</w:t>
+        <w:t>buscarLivroPorCodigo() localiza um livro pelo codigo.</w:t>
       </w:r>
     </w:p>
     <w:p>
@@ -423,7 +527,7 @@
         <w:pStyle w:val="Heading2"/>
       </w:pPr>
       <w:r>
-        <w:t>6.3 emprestimo.c</w:t>
+        <w:t>7.3 emprestimo.c</w:t>
       </w:r>
     </w:p>
     <w:p>
@@ -447,7 +551,7 @@
         <w:pStyle w:val="Heading2"/>
       </w:pPr>
       <w:r>
-        <w:t>6.4 relatorio.c</w:t>
+        <w:t>7.4 relatorio.c</w:t>
       </w:r>
     </w:p>
     <w:p>
@@ -455,7 +559,7 @@
         <w:spacing w:after="120"/>
       </w:pPr>
       <w:r>
-        <w:t>ordenarLivrosPorTitulo() ordena o vetor em memoria usando qsort e strcmp.</w:t>
+        <w:t>ordenarLivrosPorTitulo() ordena o vetor em memoria usando bubble sort e strcmp.</w:t>
       </w:r>
     </w:p>
     <w:p>
@@ -471,7 +575,7 @@
         <w:pStyle w:val="Heading2"/>
       </w:pPr>
       <w:r>
-        <w:t>6.5 utilidades.c</w:t>
+        <w:t>7.5 utilidades.c</w:t>
       </w:r>
     </w:p>
     <w:p>
@@ -487,7 +591,7 @@
         <w:spacing w:after="120"/>
       </w:pPr>
       <w:r>
-        <w:t>formatarLivro() monta uma linha de texto com codigo, titulo, autor, ano e quantidade.</w:t>
+        <w:t>formatarLivro() monta uma linha de texto com os dados do livro.</w:t>
       </w:r>
     </w:p>
     <w:p>
@@ -495,7 +599,7 @@
         <w:pStyle w:val="Heading2"/>
       </w:pPr>
       <w:r>
-        <w:t>6.6 arquivo.c</w:t>
+        <w:t>7.6 arquivo.c</w:t>
       </w:r>
     </w:p>
     <w:p>
@@ -503,15 +607,47 @@
         <w:spacing w:after="120"/>
       </w:pPr>
       <w:r>
-        <w:t>Formato do arquivo biblioteca.txt:</w:t>
+        <w:t>O modulo de persistencia grava e le os dados em dois formatos:</w:t>
       </w:r>
     </w:p>
     <w:p>
       <w:pPr>
+        <w:spacing w:after="120"/>
+      </w:pPr>
+      <w:r>
+        <w:t>biblioteca.bin (binario) - exigido pelo trabalho:</w:t>
+      </w:r>
+    </w:p>
+    <w:p>
+      <w:pPr>
         <w:pStyle w:val="ListBullet"/>
       </w:pPr>
       <w:r>
-        <w:t>Linha 1: numero total de livros</w:t>
+        <w:t>Linha inicial: total de livros (int)</w:t>
+      </w:r>
+    </w:p>
+    <w:p>
+      <w:pPr>
+        <w:pStyle w:val="ListBullet"/>
+      </w:pPr>
+      <w:r>
+        <w:t>Para cada livro: struct Livro completa gravada com fwrite/fread</w:t>
+      </w:r>
+    </w:p>
+    <w:p>
+      <w:pPr>
+        <w:spacing w:after="120"/>
+      </w:pPr>
+      <w:r>
+        <w:t>biblioteca.txt (texto) - copia legivel dos dados:</w:t>
+      </w:r>
+    </w:p>
+    <w:p>
+      <w:pPr>
+        <w:pStyle w:val="ListBullet"/>
+      </w:pPr>
+      <w:r>
+        <w:t>Linha 1: total de livros</w:t>
       </w:r>
     </w:p>
     <w:p>
@@ -527,7 +663,7 @@
         <w:spacing w:after="120"/>
       </w:pPr>
       <w:r>
-        <w:t>salvarArquivo() grava todos os livros com fprintf.</w:t>
+        <w:t>Ao salvar (opcao 9 ou ao sair), salvarArquivo() grava nos dois arquivos.</w:t>
       </w:r>
     </w:p>
     <w:p>
@@ -535,7 +671,7 @@
         <w:spacing w:after="120"/>
       </w:pPr>
       <w:r>
-        <w:t>carregarArquivo() le o arquivo com fgets e sscanf, alocando memoria conforme necessario.</w:t>
+        <w:t>Ao carregar, carregarArquivo() le o .bin se existir; caso contrario, le o .txt.</w:t>
       </w:r>
     </w:p>
     <w:p>
@@ -543,7 +679,47 @@
         <w:pStyle w:val="Heading1"/>
       </w:pPr>
       <w:r>
-        <w:t>7. Gerenciamento de Memoria</w:t>
+        <w:t>8. Suporte a Acentos (main.c)</w:t>
+      </w:r>
+    </w:p>
+    <w:p>
+      <w:pPr>
+        <w:spacing w:after="120"/>
+      </w:pPr>
+      <w:r>
+        <w:t>A funcao configurarAcentos() configura o console para exibir e receber caracteres acentuados:</w:t>
+      </w:r>
+    </w:p>
+    <w:p>
+      <w:pPr>
+        <w:pStyle w:val="ListBullet"/>
+      </w:pPr>
+      <w:r>
+        <w:t>setlocale(LC_ALL, "") para configurar a localidade do sistema</w:t>
+      </w:r>
+    </w:p>
+    <w:p>
+      <w:pPr>
+        <w:pStyle w:val="ListBullet"/>
+      </w:pPr>
+      <w:r>
+        <w:t>No Windows: SetConsoleCP(CP_UTF8) e SetConsoleOutputCP(CP_UTF8)</w:t>
+      </w:r>
+    </w:p>
+    <w:p>
+      <w:pPr>
+        <w:pStyle w:val="ListBullet"/>
+      </w:pPr>
+      <w:r>
+        <w:t>No Windows: setlocale(LC_ALL, ".UTF-8")</w:t>
+      </w:r>
+    </w:p>
+    <w:p>
+      <w:pPr>
+        <w:pStyle w:val="Heading1"/>
+      </w:pPr>
+      <w:r>
+        <w:t>9. Gerenciamento de Memoria</w:t>
       </w:r>
     </w:p>
     <w:p>
@@ -559,7 +735,7 @@
         <w:pStyle w:val="Heading1"/>
       </w:pPr>
       <w:r>
-        <w:t>8. Compilacao e Execucao</w:t>
+        <w:t>10. Compilacao e Execucao</w:t>
       </w:r>
     </w:p>
     <w:p>
@@ -575,7 +751,7 @@
         <w:spacing w:after="120"/>
       </w:pPr>
       <w:r>
-        <w:t>No terminal, na pasta do projeto, execute:</w:t>
+        <w:t>Comando de compilacao:</w:t>
       </w:r>
     </w:p>
     <w:p>
@@ -591,23 +767,15 @@
         <w:spacing w:after="120"/>
       </w:pPr>
       <w:r>
-        <w:t>Execucao: biblioteca.exe</w:t>
+        <w:t>Execucao: abrir o terminal na pasta do projeto e executar biblioteca.exe.</w:t>
       </w:r>
     </w:p>
     <w:p>
       <w:pPr>
-        <w:spacing w:after="120"/>
+        <w:pStyle w:val="Heading1"/>
       </w:pPr>
       <w:r>
-        <w:t>O programa roda no prompt de comando; utiliza locale.h e, no Windows, windows.h para configurar o console em UTF-8 e permitir acentos nos textos digitados.</w:t>
-      </w:r>
-    </w:p>
-    <w:p>
-      <w:pPr>
-        <w:pStyle w:val="Heading1"/>
-      </w:pPr>
-      <w:r>
-        <w:t>9. Conceitos de C Utilizados</w:t>
+        <w:t>11. Conceitos de C Utilizados</w:t>
       </w:r>
     </w:p>
     <w:p>
@@ -635,8 +803,11 @@
       </w:r>
     </w:p>
     <w:p>
+      <w:pPr>
+        <w:pStyle w:val="ListBullet"/>
+      </w:pPr>
       <w:r>
-        <w:t>Configuracao de localidade para acentos (setlocale e CP_UTF8)</w:t>
+        <w:t>Manipulacao de strings (strcspn, strcmp, strstr, strncpy, strncat)</w:t>
       </w:r>
     </w:p>
     <w:p>
@@ -644,7 +815,7 @@
         <w:pStyle w:val="ListBullet"/>
       </w:pPr>
       <w:r>
-        <w:t>Manipulacao de strings (strcspn, strcmp, strstr)</w:t>
+        <w:t>Ordenacao com bubble sort</w:t>
       </w:r>
     </w:p>
     <w:p>
@@ -652,7 +823,7 @@
         <w:pStyle w:val="ListBullet"/>
       </w:pPr>
       <w:r>
-        <w:t>Ordenacao com qsort</w:t>
+        <w:t>Arquivos binarios (fopen, fwrite, fread, fclose)</w:t>
       </w:r>
     </w:p>
     <w:p>
@@ -660,7 +831,7 @@
         <w:pStyle w:val="ListBullet"/>
       </w:pPr>
       <w:r>
-        <w:t>Arquivos texto (fopen, fprintf, fgets, fclose)</w:t>
+        <w:t>Arquivos texto (fopen, fprintf, fgets, sscanf, fclose)</w:t>
       </w:r>
     </w:p>
     <w:p>
@@ -681,18 +852,18 @@
     </w:p>
     <w:p>
       <w:pPr>
-        <w:pStyle w:val="Heading1"/>
+        <w:pStyle w:val="ListBullet"/>
       </w:pPr>
       <w:r>
-        <w:t>10. Arquivos do Projeto</w:t>
+        <w:t>Configuracao de localidade (setlocale)</w:t>
       </w:r>
     </w:p>
     <w:p>
       <w:pPr>
-        <w:spacing w:after="120"/>
+        <w:pStyle w:val="Heading1"/>
       </w:pPr>
       <w:r>
-        <w:t>livro.h — Cabecalho com struct e prototipos</w:t>
+        <w:t>12. Arquivos do Projeto</w:t>
       </w:r>
     </w:p>
     <w:p>
@@ -700,7 +871,7 @@
         <w:spacing w:after="120"/>
       </w:pPr>
       <w:r>
-        <w:t>main.c — Funcao main</w:t>
+        <w:t>livro.h - Cabecalho com struct e prototipos</w:t>
       </w:r>
     </w:p>
     <w:p>
@@ -708,7 +879,7 @@
         <w:spacing w:after="120"/>
       </w:pPr>
       <w:r>
-        <w:t>menu.c — Interface de menu no terminal</w:t>
+        <w:t>main.c - Funcao main e configuracao de acentos</w:t>
       </w:r>
     </w:p>
     <w:p>
@@ -716,7 +887,7 @@
         <w:spacing w:after="120"/>
       </w:pPr>
       <w:r>
-        <w:t>cadastro.c — Cadastro e listagem</w:t>
+        <w:t>menu.c - Interface de menu no terminal</w:t>
       </w:r>
     </w:p>
     <w:p>
@@ -724,7 +895,7 @@
         <w:spacing w:after="120"/>
       </w:pPr>
       <w:r>
-        <w:t>busca.c — Buscas</w:t>
+        <w:t>cadastro.c - Cadastro e listagem</w:t>
       </w:r>
     </w:p>
     <w:p>
@@ -732,7 +903,7 @@
         <w:spacing w:after="120"/>
       </w:pPr>
       <w:r>
-        <w:t>emprestimo.c — Emprestimo e devolucao</w:t>
+        <w:t>busca.c - Buscas por codigo e titulo</w:t>
       </w:r>
     </w:p>
     <w:p>
@@ -740,7 +911,7 @@
         <w:spacing w:after="120"/>
       </w:pPr>
       <w:r>
-        <w:t>relatorio.c — Ordenacao e relatorios</w:t>
+        <w:t>emprestimo.c - Emprestimo e devolucao</w:t>
       </w:r>
     </w:p>
     <w:p>
@@ -748,7 +919,7 @@
         <w:spacing w:after="120"/>
       </w:pPr>
       <w:r>
-        <w:t>utilidades.c — Funcoes auxiliares</w:t>
+        <w:t>relatorio.c - Ordenacao e relatorios</w:t>
       </w:r>
     </w:p>
     <w:p>
@@ -756,7 +927,7 @@
         <w:spacing w:after="120"/>
       </w:pPr>
       <w:r>
-        <w:t>arquivo.c — Persistencia em arquivo</w:t>
+        <w:t>utilidades.c - Funcoes auxiliares</w:t>
       </w:r>
     </w:p>
     <w:p>
@@ -764,7 +935,7 @@
         <w:spacing w:after="120"/>
       </w:pPr>
       <w:r>
-        <w:t>biblioteca.txt — Arquivo de dados (gerado/atualizado em execucao)</w:t>
+        <w:t>arquivo.c - Persistencia em binario e texto</w:t>
       </w:r>
     </w:p>
     <w:p>
@@ -772,7 +943,31 @@
         <w:spacing w:after="120"/>
       </w:pPr>
       <w:r>
-        <w:t>Documentacao_Sistema_Biblioteca.docx — Este documento</w:t>
+        <w:t>biblioteca.bin - Arquivo de dados binario</w:t>
+      </w:r>
+    </w:p>
+    <w:p>
+      <w:pPr>
+        <w:spacing w:after="120"/>
+      </w:pPr>
+      <w:r>
+        <w:t>biblioteca.txt - Arquivo de dados em texto</w:t>
+      </w:r>
+    </w:p>
+    <w:p>
+      <w:pPr>
+        <w:spacing w:after="120"/>
+      </w:pPr>
+      <w:r>
+        <w:t>biblioteca.exe - Executavel do sistema</w:t>
+      </w:r>
+    </w:p>
+    <w:p>
+      <w:pPr>
+        <w:spacing w:after="120"/>
+      </w:pPr>
+      <w:r>
+        <w:t>Documentacao_Sistema_Biblioteca.docx - Este documento</w:t>
       </w:r>
     </w:p>
     <w:sectPr>

</xml_diff>